<commit_message>
Vehicle: Upgrade legacy Particle Systems
</commit_message>
<xml_diff>
--- a/Todo.docx
+++ b/Todo.docx
@@ -140,9 +140,6 @@
       <w:r>
         <w:rPr/>
         <w:tab/>
-      </w:r>
-      <w:r>
-        <w:rPr/>
         <w:t>replace in lobby</w:t>
       </w:r>
     </w:p>
@@ -162,9 +159,6 @@
         <w:tab/>
         <w:t>-</w:t>
         <w:tab/>
-      </w:r>
-      <w:r>
-        <w:rPr/>
         <w:t>replace in hovercraft</w:t>
       </w:r>
     </w:p>
@@ -184,76 +178,7 @@
         <w:tab/>
         <w:t>-</w:t>
         <w:tab/>
-      </w:r>
-      <w:r>
-        <w:rPr/>
         <w:t>replace in jet</w:t>
-      </w:r>
-    </w:p>
-    <w:p>
-      <w:pPr>
-        <w:pStyle w:val="Normal"/>
-        <w:bidi w:val="0"/>
-        <w:jc w:val="start"/>
-        <w:rPr/>
-      </w:pPr>
-      <w:r>
-        <w:rPr/>
-        <w:tab/>
-        <w:tab/>
-        <w:tab/>
-        <w:tab/>
-        <w:tab/>
-        <w:t>-</w:t>
-        <w:tab/>
-      </w:r>
-      <w:r>
-        <w:rPr/>
-        <w:t>replace in vehicle</w:t>
-      </w:r>
-    </w:p>
-    <w:p>
-      <w:pPr>
-        <w:pStyle w:val="Normal"/>
-        <w:bidi w:val="0"/>
-        <w:jc w:val="start"/>
-        <w:rPr/>
-      </w:pPr>
-      <w:r>
-        <w:rPr/>
-        <w:tab/>
-        <w:tab/>
-        <w:tab/>
-        <w:tab/>
-        <w:tab/>
-        <w:t>-</w:t>
-        <w:tab/>
-      </w:r>
-      <w:r>
-        <w:rPr/>
-        <w:t>replace in EntryPoint</w:t>
-      </w:r>
-    </w:p>
-    <w:p>
-      <w:pPr>
-        <w:pStyle w:val="Normal"/>
-        <w:bidi w:val="0"/>
-        <w:jc w:val="start"/>
-        <w:rPr/>
-      </w:pPr>
-      <w:r>
-        <w:rPr/>
-        <w:tab/>
-        <w:tab/>
-        <w:tab/>
-        <w:tab/>
-        <w:tab/>
-        <w:t>-</w:t>
-        <w:tab/>
-      </w:r>
-      <w:r>
-        <w:rPr/>
-        <w:t>replace in JumpPoint</w:t>
       </w:r>
     </w:p>
     <w:p>
@@ -280,9 +205,71 @@
       <w:r>
         <w:rPr/>
         <w:tab/>
-      </w:r>
-      <w:r>
-        <w:rPr/>
+        <w:t>replace in vehicle</w:t>
+      </w:r>
+    </w:p>
+    <w:p>
+      <w:pPr>
+        <w:pStyle w:val="Normal"/>
+        <w:bidi w:val="0"/>
+        <w:jc w:val="start"/>
+        <w:rPr/>
+      </w:pPr>
+      <w:r>
+        <w:rPr/>
+        <w:tab/>
+        <w:tab/>
+        <w:tab/>
+        <w:tab/>
+        <w:tab/>
+        <w:t>-</w:t>
+        <w:tab/>
+        <w:t>replace in EntryPoint</w:t>
+      </w:r>
+    </w:p>
+    <w:p>
+      <w:pPr>
+        <w:pStyle w:val="Normal"/>
+        <w:bidi w:val="0"/>
+        <w:jc w:val="start"/>
+        <w:rPr/>
+      </w:pPr>
+      <w:r>
+        <w:rPr/>
+        <w:tab/>
+        <w:tab/>
+        <w:tab/>
+        <w:tab/>
+        <w:tab/>
+        <w:t>-</w:t>
+        <w:tab/>
+        <w:t>replace in JumpPoint</w:t>
+      </w:r>
+    </w:p>
+    <w:p>
+      <w:pPr>
+        <w:pStyle w:val="Normal"/>
+        <w:bidi w:val="0"/>
+        <w:jc w:val="start"/>
+        <w:rPr/>
+      </w:pPr>
+      <w:r>
+        <w:rPr/>
+        <w:tab/>
+        <w:tab/>
+        <w:tab/>
+        <w:tab/>
+        <w:tab/>
+      </w:r>
+      <w:r>
+        <w:rPr>
+          <w:color w:val="00A933"/>
+        </w:rPr>
+        <w:t>X</w:t>
+      </w:r>
+      <w:r>
+        <w:rPr/>
+        <w:tab/>
         <w:t>replace in PlasmaSparks</w:t>
       </w:r>
     </w:p>
@@ -524,7 +511,7 @@
     </w:p>
     <w:sectPr>
       <w:type w:val="nextPage"/>
-      <w:pgSz w:w="18720" w:h="17280"/>
+      <w:pgSz w:w="18720" w:h="17291"/>
       <w:pgMar w:left="1136" w:right="1136" w:gutter="0" w:header="0" w:top="1136" w:footer="0" w:bottom="1136"/>
       <w:pgNumType w:fmt="none"/>
       <w:formProt w:val="false"/>
@@ -572,8 +559,8 @@
       <w:lang w:val="en-US" w:eastAsia="zh-CN" w:bidi="hi-IN"/>
     </w:rPr>
   </w:style>
-  <w:style w:type="character" w:styleId="Bullets">
-    <w:name w:val="Bullets"/>
+  <w:style w:type="character" w:styleId="Bulletsuser">
+    <w:name w:val="Bullets (user)"/>
     <w:qFormat/>
     <w:rPr>
       <w:rFonts w:ascii="OpenSymbol" w:hAnsi="OpenSymbol" w:eastAsia="OpenSymbol" w:cs="OpenSymbol"/>

</xml_diff>

<commit_message>
Settings: replace ParticleEmitter with ParticleSystem
</commit_message>
<xml_diff>
--- a/Todo.docx
+++ b/Todo.docx
@@ -254,6 +254,30 @@
         <w:rPr/>
       </w:pPr>
       <w:r>
+        <w:rPr>
+          <w:color w:val="00A933"/>
+        </w:rPr>
+        <w:tab/>
+        <w:tab/>
+        <w:tab/>
+        <w:tab/>
+        <w:tab/>
+        <w:t>X</w:t>
+      </w:r>
+      <w:r>
+        <w:rPr/>
+        <w:tab/>
+        <w:t>replace in PlasmaSparks</w:t>
+      </w:r>
+    </w:p>
+    <w:p>
+      <w:pPr>
+        <w:pStyle w:val="Normal"/>
+        <w:bidi w:val="0"/>
+        <w:jc w:val="start"/>
+        <w:rPr/>
+      </w:pPr>
+      <w:r>
         <w:rPr/>
         <w:tab/>
         <w:tab/>
@@ -270,7 +294,7 @@
       <w:r>
         <w:rPr/>
         <w:tab/>
-        <w:t>replace in PlasmaSparks</w:t>
+        <w:t>replace in Settings</w:t>
       </w:r>
     </w:p>
     <w:p>

</xml_diff>

<commit_message>
Hovercraft: replace legacy particles with particlesystems
</commit_message>
<xml_diff>
--- a/Todo.docx
+++ b/Todo.docx
@@ -157,7 +157,15 @@
         <w:tab/>
         <w:tab/>
         <w:tab/>
-        <w:t>-</w:t>
+      </w:r>
+      <w:r>
+        <w:rPr>
+          <w:color w:val="00A933"/>
+        </w:rPr>
+        <w:t>X</w:t>
+      </w:r>
+      <w:r>
+        <w:rPr/>
         <w:tab/>
         <w:t>replace in hovercraft</w:t>
       </w:r>

</xml_diff>

<commit_message>
Jet: replace legacy particles with particlesystems
</commit_message>
<xml_diff>
--- a/Todo.docx
+++ b/Todo.docx
@@ -184,7 +184,15 @@
         <w:tab/>
         <w:tab/>
         <w:tab/>
-        <w:t>-</w:t>
+      </w:r>
+      <w:r>
+        <w:rPr>
+          <w:color w:val="00A933"/>
+        </w:rPr>
+        <w:t>X</w:t>
+      </w:r>
+      <w:r>
+        <w:rPr/>
         <w:tab/>
         <w:t>replace in jet</w:t>
       </w:r>

</xml_diff>

<commit_message>
EntryPoint: replace legacy particles with particlesystem
</commit_message>
<xml_diff>
--- a/Todo.docx
+++ b/Todo.docx
@@ -238,7 +238,15 @@
         <w:tab/>
         <w:tab/>
         <w:tab/>
-        <w:t>-</w:t>
+      </w:r>
+      <w:r>
+        <w:rPr>
+          <w:color w:val="00A933"/>
+        </w:rPr>
+        <w:t>X</w:t>
+      </w:r>
+      <w:r>
+        <w:rPr/>
         <w:tab/>
         <w:t>replace in EntryPoint</w:t>
       </w:r>

</xml_diff>

<commit_message>
JumpPoint: replace legacy particles with particlesystem
</commit_message>
<xml_diff>
--- a/Todo.docx
+++ b/Todo.docx
@@ -111,25 +111,6 @@
         <w:tab/>
         <w:tab/>
         <w:tab/>
-        <w:t>-</w:t>
-        <w:tab/>
-        <w:t>replace legacy particles with ParticleSystem</w:t>
-      </w:r>
-    </w:p>
-    <w:p>
-      <w:pPr>
-        <w:pStyle w:val="Normal"/>
-        <w:bidi w:val="0"/>
-        <w:jc w:val="start"/>
-        <w:rPr/>
-      </w:pPr>
-      <w:r>
-        <w:rPr/>
-        <w:tab/>
-        <w:tab/>
-        <w:tab/>
-        <w:tab/>
-        <w:tab/>
       </w:r>
       <w:r>
         <w:rPr>
@@ -140,7 +121,7 @@
       <w:r>
         <w:rPr/>
         <w:tab/>
-        <w:t>replace in lobby</w:t>
+        <w:t>replace legacy particles with ParticleSystem</w:t>
       </w:r>
     </w:p>
     <w:p>
@@ -167,7 +148,7 @@
       <w:r>
         <w:rPr/>
         <w:tab/>
-        <w:t>replace in hovercraft</w:t>
+        <w:t>replace in lobby</w:t>
       </w:r>
     </w:p>
     <w:p>
@@ -194,7 +175,7 @@
       <w:r>
         <w:rPr/>
         <w:tab/>
-        <w:t>replace in jet</w:t>
+        <w:t>replace in hovercraft</w:t>
       </w:r>
     </w:p>
     <w:p>
@@ -221,7 +202,7 @@
       <w:r>
         <w:rPr/>
         <w:tab/>
-        <w:t>replace in vehicle</w:t>
+        <w:t>replace in jet</w:t>
       </w:r>
     </w:p>
     <w:p>
@@ -248,50 +229,7 @@
       <w:r>
         <w:rPr/>
         <w:tab/>
-        <w:t>replace in EntryPoint</w:t>
-      </w:r>
-    </w:p>
-    <w:p>
-      <w:pPr>
-        <w:pStyle w:val="Normal"/>
-        <w:bidi w:val="0"/>
-        <w:jc w:val="start"/>
-        <w:rPr/>
-      </w:pPr>
-      <w:r>
-        <w:rPr/>
-        <w:tab/>
-        <w:tab/>
-        <w:tab/>
-        <w:tab/>
-        <w:tab/>
-        <w:t>-</w:t>
-        <w:tab/>
-        <w:t>replace in JumpPoint</w:t>
-      </w:r>
-    </w:p>
-    <w:p>
-      <w:pPr>
-        <w:pStyle w:val="Normal"/>
-        <w:bidi w:val="0"/>
-        <w:jc w:val="start"/>
-        <w:rPr/>
-      </w:pPr>
-      <w:r>
-        <w:rPr>
-          <w:color w:val="00A933"/>
-        </w:rPr>
-        <w:tab/>
-        <w:tab/>
-        <w:tab/>
-        <w:tab/>
-        <w:tab/>
-        <w:t>X</w:t>
-      </w:r>
-      <w:r>
-        <w:rPr/>
-        <w:tab/>
-        <w:t>replace in PlasmaSparks</w:t>
+        <w:t>replace in vehicle</w:t>
       </w:r>
     </w:p>
     <w:p>
@@ -318,6 +256,81 @@
       <w:r>
         <w:rPr/>
         <w:tab/>
+        <w:t>replace in EntryPoint</w:t>
+      </w:r>
+    </w:p>
+    <w:p>
+      <w:pPr>
+        <w:pStyle w:val="Normal"/>
+        <w:bidi w:val="0"/>
+        <w:jc w:val="start"/>
+        <w:rPr/>
+      </w:pPr>
+      <w:r>
+        <w:rPr/>
+        <w:tab/>
+        <w:tab/>
+        <w:tab/>
+        <w:tab/>
+        <w:tab/>
+      </w:r>
+      <w:r>
+        <w:rPr>
+          <w:color w:val="00A933"/>
+        </w:rPr>
+        <w:t>X</w:t>
+      </w:r>
+      <w:r>
+        <w:rPr/>
+        <w:tab/>
+        <w:t>replace in JumpPoint</w:t>
+      </w:r>
+    </w:p>
+    <w:p>
+      <w:pPr>
+        <w:pStyle w:val="Normal"/>
+        <w:bidi w:val="0"/>
+        <w:jc w:val="start"/>
+        <w:rPr/>
+      </w:pPr>
+      <w:r>
+        <w:rPr>
+          <w:color w:val="00A933"/>
+        </w:rPr>
+        <w:tab/>
+        <w:tab/>
+        <w:tab/>
+        <w:tab/>
+        <w:tab/>
+        <w:t>X</w:t>
+      </w:r>
+      <w:r>
+        <w:rPr/>
+        <w:tab/>
+        <w:t>replace in PlasmaSparks</w:t>
+      </w:r>
+    </w:p>
+    <w:p>
+      <w:pPr>
+        <w:pStyle w:val="Normal"/>
+        <w:bidi w:val="0"/>
+        <w:jc w:val="start"/>
+        <w:rPr/>
+      </w:pPr>
+      <w:r>
+        <w:rPr>
+          <w:color w:val="00A933"/>
+        </w:rPr>
+        <w:tab/>
+        <w:tab/>
+        <w:tab/>
+        <w:tab/>
+        <w:tab/>
+        <w:t>X</w:t>
+      </w:r>
+      <w:r>
+        <w:rPr/>
+        <w:tab/>
         <w:t>replace in Settings</w:t>
       </w:r>
     </w:p>
@@ -333,6 +346,28 @@
         <w:tab/>
         <w:tab/>
         <w:tab/>
+        <w:tab/>
+        <w:tab/>
+        <w:t>-</w:t>
+        <w:tab/>
+      </w:r>
+      <w:r>
+        <w:rPr/>
+        <w:t>replace in Whirlds/Classics/Fire.prefab</w:t>
+      </w:r>
+    </w:p>
+    <w:p>
+      <w:pPr>
+        <w:pStyle w:val="Normal"/>
+        <w:bidi w:val="0"/>
+        <w:jc w:val="start"/>
+        <w:rPr/>
+      </w:pPr>
+      <w:r>
+        <w:rPr/>
+        <w:tab/>
+        <w:tab/>
+        <w:tab/>
         <w:t>-</w:t>
         <w:tab/>
         <w:t>replace legacy GUI system elements with new GUI system elements</w:t>
@@ -544,6 +579,24 @@
         <w:t>-</w:t>
         <w:tab/>
         <w:t>add support for placing rigidbodies</w:t>
+      </w:r>
+    </w:p>
+    <w:p>
+      <w:pPr>
+        <w:pStyle w:val="Normal"/>
+        <w:bidi w:val="0"/>
+        <w:jc w:val="start"/>
+        <w:rPr/>
+      </w:pPr>
+      <w:r>
+        <w:rPr/>
+        <w:tab/>
+        <w:t>-</w:t>
+        <w:tab/>
+      </w:r>
+      <w:r>
+        <w:rPr/>
+        <w:t>add support for placing Whirlds/Classics/Fire.prefab</w:t>
       </w:r>
     </w:p>
     <w:p>

</xml_diff>

<commit_message>
Whirlds/Classics/Fire.prefab: replace legacy particles with particlesystems
</commit_message>
<xml_diff>
--- a/Todo.docx
+++ b/Todo.docx
@@ -348,7 +348,15 @@
         <w:tab/>
         <w:tab/>
         <w:tab/>
-        <w:t>-</w:t>
+      </w:r>
+      <w:r>
+        <w:rPr>
+          <w:color w:val="00A933"/>
+        </w:rPr>
+        <w:t>X</w:t>
+      </w:r>
+      <w:r>
+        <w:rPr/>
         <w:tab/>
       </w:r>
       <w:r>

</xml_diff>

<commit_message>
LobbyDecor: replace legacy gui with Unity.UI
</commit_message>
<xml_diff>
--- a/Todo.docx
+++ b/Todo.docx
@@ -366,9 +366,6 @@
       <w:r>
         <w:rPr/>
         <w:tab/>
-      </w:r>
-      <w:r>
-        <w:rPr/>
         <w:t>replace in Whirlds/Classics/Fire.prefab</w:t>
       </w:r>
     </w:p>
@@ -401,6 +398,56 @@
         <w:tab/>
         <w:tab/>
         <w:tab/>
+        <w:tab/>
+        <w:t>-</w:t>
+        <w:tab/>
+      </w:r>
+      <w:r>
+        <w:rPr/>
+        <w:t>replace in CameraVehicle</w:t>
+      </w:r>
+    </w:p>
+    <w:p>
+      <w:pPr>
+        <w:pStyle w:val="Normal"/>
+        <w:bidi w:val="0"/>
+        <w:jc w:val="start"/>
+        <w:rPr/>
+      </w:pPr>
+      <w:r>
+        <w:rPr/>
+        <w:tab/>
+        <w:tab/>
+        <w:tab/>
+        <w:tab/>
+      </w:r>
+      <w:r>
+        <w:rPr>
+          <w:color w:val="00A933"/>
+        </w:rPr>
+        <w:t>X</w:t>
+      </w:r>
+      <w:r>
+        <w:rPr/>
+        <w:tab/>
+      </w:r>
+      <w:r>
+        <w:rPr/>
+        <w:t>replace in LobbyDecor</w:t>
+      </w:r>
+    </w:p>
+    <w:p>
+      <w:pPr>
+        <w:pStyle w:val="Normal"/>
+        <w:bidi w:val="0"/>
+        <w:jc w:val="start"/>
+        <w:rPr/>
+      </w:pPr>
+      <w:r>
+        <w:rPr/>
+        <w:tab/>
+        <w:tab/>
+        <w:tab/>
         <w:t>-</w:t>
         <w:tab/>
         <w:t>temporarily remove (comment) features that rely on legacy MasterServer, NATFacilitator, and ConnectionTester</w:t>
@@ -609,9 +656,6 @@
         <w:tab/>
         <w:t>-</w:t>
         <w:tab/>
-      </w:r>
-      <w:r>
-        <w:rPr/>
         <w:t>add support for placing Whirlds/Classics/Fire.prefab</w:t>
       </w:r>
     </w:p>
@@ -676,8 +720,8 @@
       <w:lang w:val="en-US" w:eastAsia="zh-CN" w:bidi="hi-IN"/>
     </w:rPr>
   </w:style>
-  <w:style w:type="character" w:styleId="Bulletsuser">
-    <w:name w:val="Bullets (user)"/>
+  <w:style w:type="character" w:styleId="Bullets">
+    <w:name w:val="Bullets"/>
     <w:qFormat/>
     <w:rPr>
       <w:rFonts w:ascii="OpenSymbol" w:hAnsi="OpenSymbol" w:eastAsia="OpenSymbol" w:cs="OpenSymbol"/>

</xml_diff>

<commit_message>
temporarily comment out legacy Master/Nat/CT features in Lobby
</commit_message>
<xml_diff>
--- a/Todo.docx
+++ b/Todo.docx
@@ -381,7 +381,15 @@
         <w:tab/>
         <w:tab/>
         <w:tab/>
-        <w:t>-</w:t>
+      </w:r>
+      <w:r>
+        <w:rPr>
+          <w:color w:val="00A933"/>
+        </w:rPr>
+        <w:t>X</w:t>
+      </w:r>
+      <w:r>
+        <w:rPr/>
         <w:tab/>
         <w:t>replace legacy GUI system elements with new GUI system elements</w:t>
       </w:r>
@@ -399,11 +407,16 @@
         <w:tab/>
         <w:tab/>
         <w:tab/>
-        <w:t>-</w:t>
-        <w:tab/>
-      </w:r>
-      <w:r>
-        <w:rPr/>
+      </w:r>
+      <w:r>
+        <w:rPr>
+          <w:color w:val="00A933"/>
+        </w:rPr>
+        <w:t>X</w:t>
+      </w:r>
+      <w:r>
+        <w:rPr/>
+        <w:tab/>
         <w:t>replace in CameraVehicle</w:t>
       </w:r>
     </w:p>
@@ -430,9 +443,6 @@
       <w:r>
         <w:rPr/>
         <w:tab/>
-      </w:r>
-      <w:r>
-        <w:rPr/>
         <w:t>replace in LobbyDecor</w:t>
       </w:r>
     </w:p>
@@ -448,7 +458,15 @@
         <w:tab/>
         <w:tab/>
         <w:tab/>
-        <w:t>-</w:t>
+      </w:r>
+      <w:r>
+        <w:rPr>
+          <w:color w:val="00A933"/>
+        </w:rPr>
+        <w:t>X</w:t>
+      </w:r>
+      <w:r>
+        <w:rPr/>
         <w:tab/>
         <w:t>temporarily remove (comment) features that rely on legacy MasterServer, NATFacilitator, and ConnectionTester</w:t>
       </w:r>
@@ -468,6 +486,57 @@
         <w:t>-</w:t>
         <w:tab/>
         <w:t>replace NetworkView, Network.RPC and related with up-to-date counterparts</w:t>
+      </w:r>
+    </w:p>
+    <w:p>
+      <w:pPr>
+        <w:pStyle w:val="Normal"/>
+        <w:bidi w:val="0"/>
+        <w:jc w:val="start"/>
+        <w:rPr/>
+      </w:pPr>
+      <w:r>
+        <w:rPr/>
+        <w:t>-</w:t>
+        <w:tab/>
+      </w:r>
+      <w:r>
+        <w:rPr/>
+        <w:t>add network udp discovery in the server list for LAN games</w:t>
+      </w:r>
+    </w:p>
+    <w:p>
+      <w:pPr>
+        <w:pStyle w:val="Normal"/>
+        <w:bidi w:val="0"/>
+        <w:jc w:val="start"/>
+        <w:rPr/>
+      </w:pPr>
+      <w:r>
+        <w:rPr/>
+        <w:t>-</w:t>
+        <w:tab/>
+      </w:r>
+      <w:r>
+        <w:rPr/>
+        <w:t>add a new master server system</w:t>
+      </w:r>
+    </w:p>
+    <w:p>
+      <w:pPr>
+        <w:pStyle w:val="Normal"/>
+        <w:bidi w:val="0"/>
+        <w:jc w:val="start"/>
+        <w:rPr/>
+      </w:pPr>
+      <w:r>
+        <w:rPr/>
+        <w:t>-</w:t>
+        <w:tab/>
+      </w:r>
+      <w:r>
+        <w:rPr/>
+        <w:t>use openrelay for NAT facilitation</w:t>
       </w:r>
     </w:p>
     <w:p>
@@ -720,8 +789,8 @@
       <w:lang w:val="en-US" w:eastAsia="zh-CN" w:bidi="hi-IN"/>
     </w:rPr>
   </w:style>
-  <w:style w:type="character" w:styleId="Bullets">
-    <w:name w:val="Bullets"/>
+  <w:style w:type="character" w:styleId="Bulletsuser">
+    <w:name w:val="Bullets (user)"/>
     <w:qFormat/>
     <w:rPr>
       <w:rFonts w:ascii="OpenSymbol" w:hAnsi="OpenSymbol" w:eastAsia="OpenSymbol" w:cs="OpenSymbol"/>

</xml_diff>

<commit_message>
temp remove networking: Game
</commit_message>
<xml_diff>
--- a/Todo.docx
+++ b/Todo.docx
@@ -539,7 +539,15 @@
         <w:tab/>
         <w:tab/>
         <w:tab/>
-        <w:t>-</w:t>
+      </w:r>
+      <w:r>
+        <w:rPr>
+          <w:color w:val="00A933"/>
+        </w:rPr>
+        <w:t>X</w:t>
+      </w:r>
+      <w:r>
+        <w:rPr/>
         <w:tab/>
       </w:r>
       <w:r>
@@ -561,6 +569,221 @@
         <w:tab/>
         <w:tab/>
         <w:t>-</w:t>
+        <w:tab/>
+      </w:r>
+      <w:r>
+        <w:rPr/>
+        <w:t>remove in Messaging</w:t>
+      </w:r>
+    </w:p>
+    <w:p>
+      <w:pPr>
+        <w:pStyle w:val="Normal"/>
+        <w:bidi w:val="0"/>
+        <w:jc w:val="start"/>
+        <w:rPr/>
+      </w:pPr>
+      <w:r>
+        <w:rPr/>
+        <w:tab/>
+        <w:tab/>
+        <w:tab/>
+        <w:tab/>
+        <w:t>-</w:t>
+        <w:tab/>
+      </w:r>
+      <w:r>
+        <w:rPr/>
+        <w:t>remove in Settings</w:t>
+      </w:r>
+    </w:p>
+    <w:p>
+      <w:pPr>
+        <w:pStyle w:val="Normal"/>
+        <w:bidi w:val="0"/>
+        <w:jc w:val="start"/>
+        <w:rPr/>
+      </w:pPr>
+      <w:r>
+        <w:rPr/>
+        <w:tab/>
+        <w:tab/>
+        <w:tab/>
+        <w:tab/>
+        <w:t>-</w:t>
+        <w:tab/>
+      </w:r>
+      <w:r>
+        <w:rPr/>
+        <w:t>remove in Rocket</w:t>
+      </w:r>
+    </w:p>
+    <w:p>
+      <w:pPr>
+        <w:pStyle w:val="Normal"/>
+        <w:bidi w:val="0"/>
+        <w:jc w:val="start"/>
+        <w:rPr/>
+      </w:pPr>
+      <w:r>
+        <w:rPr/>
+        <w:tab/>
+        <w:tab/>
+        <w:tab/>
+        <w:tab/>
+        <w:t>-</w:t>
+        <w:tab/>
+      </w:r>
+      <w:r>
+        <w:rPr/>
+        <w:t>remove in RamoSphere</w:t>
+      </w:r>
+    </w:p>
+    <w:p>
+      <w:pPr>
+        <w:pStyle w:val="Normal"/>
+        <w:bidi w:val="0"/>
+        <w:jc w:val="start"/>
+        <w:rPr/>
+      </w:pPr>
+      <w:r>
+        <w:rPr/>
+        <w:tab/>
+        <w:tab/>
+        <w:tab/>
+        <w:tab/>
+        <w:t>-</w:t>
+        <w:tab/>
+      </w:r>
+      <w:r>
+        <w:rPr/>
+        <w:t>remove in Vehicle</w:t>
+      </w:r>
+    </w:p>
+    <w:p>
+      <w:pPr>
+        <w:pStyle w:val="Normal"/>
+        <w:bidi w:val="0"/>
+        <w:jc w:val="start"/>
+        <w:rPr/>
+      </w:pPr>
+      <w:r>
+        <w:rPr/>
+        <w:tab/>
+        <w:tab/>
+        <w:tab/>
+        <w:tab/>
+        <w:t>-</w:t>
+        <w:tab/>
+      </w:r>
+      <w:r>
+        <w:rPr/>
+        <w:t>remove in VehicleBot</w:t>
+      </w:r>
+    </w:p>
+    <w:p>
+      <w:pPr>
+        <w:pStyle w:val="Normal"/>
+        <w:bidi w:val="0"/>
+        <w:jc w:val="start"/>
+        <w:rPr/>
+      </w:pPr>
+      <w:r>
+        <w:rPr/>
+        <w:tab/>
+        <w:tab/>
+        <w:tab/>
+        <w:tab/>
+        <w:t>-</w:t>
+        <w:tab/>
+      </w:r>
+      <w:r>
+        <w:rPr/>
+        <w:t>remove in VehicleLocal</w:t>
+      </w:r>
+    </w:p>
+    <w:p>
+      <w:pPr>
+        <w:pStyle w:val="Normal"/>
+        <w:bidi w:val="0"/>
+        <w:jc w:val="start"/>
+        <w:rPr/>
+      </w:pPr>
+      <w:r>
+        <w:rPr/>
+        <w:tab/>
+        <w:tab/>
+        <w:tab/>
+        <w:tab/>
+        <w:t>-</w:t>
+        <w:tab/>
+      </w:r>
+      <w:r>
+        <w:rPr/>
+        <w:t>remove in VehicleMe</w:t>
+      </w:r>
+    </w:p>
+    <w:p>
+      <w:pPr>
+        <w:pStyle w:val="Normal"/>
+        <w:bidi w:val="0"/>
+        <w:jc w:val="start"/>
+        <w:rPr/>
+      </w:pPr>
+      <w:r>
+        <w:rPr/>
+        <w:tab/>
+        <w:tab/>
+        <w:tab/>
+        <w:tab/>
+        <w:t>-</w:t>
+        <w:tab/>
+      </w:r>
+      <w:r>
+        <w:rPr/>
+        <w:t>remove in VehicleNet</w:t>
+      </w:r>
+    </w:p>
+    <w:p>
+      <w:pPr>
+        <w:pStyle w:val="Normal"/>
+        <w:bidi w:val="0"/>
+        <w:jc w:val="start"/>
+        <w:rPr/>
+      </w:pPr>
+      <w:r>
+        <w:rPr/>
+        <w:tab/>
+        <w:tab/>
+        <w:tab/>
+        <w:tab/>
+        <w:t>-</w:t>
+        <w:tab/>
+      </w:r>
+      <w:r>
+        <w:rPr/>
+        <w:t>remove in VehicleTrigger</w:t>
+      </w:r>
+    </w:p>
+    <w:p>
+      <w:pPr>
+        <w:pStyle w:val="Normal"/>
+        <w:bidi w:val="0"/>
+        <w:jc w:val="start"/>
+        <w:rPr/>
+      </w:pPr>
+      <w:r>
+        <w:rPr/>
+        <w:tab/>
+        <w:tab/>
+        <w:tab/>
+        <w:tab/>
+        <w:t>-</w:t>
+        <w:tab/>
+      </w:r>
+      <w:r>
+        <w:rPr/>
+        <w:t>remove in Tank</w:t>
       </w:r>
     </w:p>
     <w:p>

</xml_diff>

<commit_message>
temp remove networking: Vehicle
</commit_message>
<xml_diff>
--- a/Todo.docx
+++ b/Todo.docx
@@ -652,7 +652,15 @@
         <w:tab/>
         <w:tab/>
         <w:tab/>
-        <w:t>-</w:t>
+      </w:r>
+      <w:r>
+        <w:rPr>
+          <w:color w:val="00A933"/>
+        </w:rPr>
+        <w:t>X</w:t>
+      </w:r>
+      <w:r>
+        <w:rPr/>
         <w:tab/>
       </w:r>
       <w:r>

</xml_diff>

<commit_message>
temp remove networking: Settings
</commit_message>
<xml_diff>
--- a/Todo.docx
+++ b/Todo.docx
@@ -568,7 +568,15 @@
         <w:tab/>
         <w:tab/>
         <w:tab/>
-        <w:t>-</w:t>
+      </w:r>
+      <w:r>
+        <w:rPr>
+          <w:color w:val="00A933"/>
+        </w:rPr>
+        <w:t>X</w:t>
+      </w:r>
+      <w:r>
+        <w:rPr/>
         <w:tab/>
       </w:r>
       <w:r>
@@ -589,7 +597,15 @@
         <w:tab/>
         <w:tab/>
         <w:tab/>
-        <w:t>-</w:t>
+      </w:r>
+      <w:r>
+        <w:rPr>
+          <w:color w:val="00A933"/>
+        </w:rPr>
+        <w:t>X</w:t>
+      </w:r>
+      <w:r>
+        <w:rPr/>
         <w:tab/>
       </w:r>
       <w:r>

</xml_diff>

<commit_message>
temp remove networking: Rocket
</commit_message>
<xml_diff>
--- a/Todo.docx
+++ b/Todo.docx
@@ -626,7 +626,15 @@
         <w:tab/>
         <w:tab/>
         <w:tab/>
-        <w:t>-</w:t>
+      </w:r>
+      <w:r>
+        <w:rPr>
+          <w:color w:val="00A933"/>
+        </w:rPr>
+        <w:t>X</w:t>
+      </w:r>
+      <w:r>
+        <w:rPr/>
         <w:tab/>
       </w:r>
       <w:r>

</xml_diff>

<commit_message>
temp remove networking: RamoSphere
</commit_message>
<xml_diff>
--- a/Todo.docx
+++ b/Todo.docx
@@ -655,7 +655,15 @@
         <w:tab/>
         <w:tab/>
         <w:tab/>
-        <w:t>-</w:t>
+      </w:r>
+      <w:r>
+        <w:rPr>
+          <w:color w:val="00A933"/>
+        </w:rPr>
+        <w:t>X</w:t>
+      </w:r>
+      <w:r>
+        <w:rPr/>
         <w:tab/>
       </w:r>
       <w:r>

</xml_diff>

<commit_message>
temp remove networking: VehicleLocal
</commit_message>
<xml_diff>
--- a/Todo.docx
+++ b/Todo.docx
@@ -713,7 +713,15 @@
         <w:tab/>
         <w:tab/>
         <w:tab/>
-        <w:t>-</w:t>
+      </w:r>
+      <w:r>
+        <w:rPr>
+          <w:color w:val="00A933"/>
+        </w:rPr>
+        <w:t>X</w:t>
+      </w:r>
+      <w:r>
+        <w:rPr/>
         <w:tab/>
       </w:r>
       <w:r>
@@ -734,7 +742,15 @@
         <w:tab/>
         <w:tab/>
         <w:tab/>
-        <w:t>-</w:t>
+      </w:r>
+      <w:r>
+        <w:rPr>
+          <w:color w:val="00A933"/>
+        </w:rPr>
+        <w:t>X</w:t>
+      </w:r>
+      <w:r>
+        <w:rPr/>
         <w:tab/>
       </w:r>
       <w:r>

</xml_diff>

<commit_message>
temp remove networking: VehicleNet
</commit_message>
<xml_diff>
--- a/Todo.docx
+++ b/Todo.docx
@@ -771,7 +771,15 @@
         <w:tab/>
         <w:tab/>
         <w:tab/>
-        <w:t>-</w:t>
+      </w:r>
+      <w:r>
+        <w:rPr>
+          <w:color w:val="00A933"/>
+        </w:rPr>
+        <w:t>X</w:t>
+      </w:r>
+      <w:r>
+        <w:rPr/>
         <w:tab/>
       </w:r>
       <w:r>
@@ -792,7 +800,15 @@
         <w:tab/>
         <w:tab/>
         <w:tab/>
-        <w:t>-</w:t>
+      </w:r>
+      <w:r>
+        <w:rPr>
+          <w:color w:val="00A933"/>
+        </w:rPr>
+        <w:t>X</w:t>
+      </w:r>
+      <w:r>
+        <w:rPr/>
         <w:tab/>
       </w:r>
       <w:r>

</xml_diff>

<commit_message>
temp remove networking: VehicleTrigger
</commit_message>
<xml_diff>
--- a/Todo.docx
+++ b/Todo.docx
@@ -829,7 +829,15 @@
         <w:tab/>
         <w:tab/>
         <w:tab/>
-        <w:t>-</w:t>
+      </w:r>
+      <w:r>
+        <w:rPr>
+          <w:color w:val="00A933"/>
+        </w:rPr>
+        <w:t>X</w:t>
+      </w:r>
+      <w:r>
+        <w:rPr/>
         <w:tab/>
       </w:r>
       <w:r>

</xml_diff>

<commit_message>
temp remove networking: Tank
</commit_message>
<xml_diff>
--- a/Todo.docx
+++ b/Todo.docx
@@ -858,7 +858,15 @@
         <w:tab/>
         <w:tab/>
         <w:tab/>
-        <w:t>-</w:t>
+      </w:r>
+      <w:r>
+        <w:rPr>
+          <w:color w:val="00A933"/>
+        </w:rPr>
+        <w:t>X</w:t>
+      </w:r>
+      <w:r>
+        <w:rPr/>
         <w:tab/>
       </w:r>
       <w:r>

</xml_diff>

<commit_message>
more plans in Todo.docx
</commit_message>
<xml_diff>
--- a/Todo.docx
+++ b/Todo.docx
@@ -63,6 +63,133 @@
         <w:t>-</w:t>
         <w:tab/>
         <w:t>upgrade to 2022</w:t>
+      </w:r>
+    </w:p>
+    <w:p>
+      <w:pPr>
+        <w:pStyle w:val="Normal"/>
+        <w:bidi w:val="0"/>
+        <w:jc w:val="start"/>
+        <w:rPr/>
+      </w:pPr>
+      <w:r>
+        <w:rPr/>
+        <w:tab/>
+        <w:tab/>
+        <w:t>-</w:t>
+        <w:tab/>
+      </w:r>
+      <w:r>
+        <w:rPr/>
+        <w:t>upgrade to 2019.4.41f2</w:t>
+      </w:r>
+    </w:p>
+    <w:p>
+      <w:pPr>
+        <w:pStyle w:val="Normal"/>
+        <w:bidi w:val="0"/>
+        <w:jc w:val="start"/>
+        <w:rPr/>
+      </w:pPr>
+      <w:r>
+        <w:rPr/>
+        <w:tab/>
+        <w:tab/>
+        <w:tab/>
+      </w:r>
+      <w:r>
+        <w:rPr>
+          <w:color w:val="00A933"/>
+        </w:rPr>
+        <w:t>X</w:t>
+      </w:r>
+      <w:r>
+        <w:rPr/>
+        <w:tab/>
+      </w:r>
+      <w:r>
+        <w:rPr/>
+        <w:t>initial upgrade</w:t>
+      </w:r>
+    </w:p>
+    <w:p>
+      <w:pPr>
+        <w:pStyle w:val="Normal"/>
+        <w:bidi w:val="0"/>
+        <w:jc w:val="start"/>
+        <w:rPr/>
+      </w:pPr>
+      <w:r>
+        <w:rPr/>
+        <w:tab/>
+        <w:tab/>
+        <w:tab/>
+        <w:t>-</w:t>
+        <w:tab/>
+      </w:r>
+      <w:r>
+        <w:rPr/>
+        <w:t>fix terrain</w:t>
+      </w:r>
+    </w:p>
+    <w:p>
+      <w:pPr>
+        <w:pStyle w:val="Normal"/>
+        <w:bidi w:val="0"/>
+        <w:jc w:val="start"/>
+        <w:rPr/>
+      </w:pPr>
+      <w:r>
+        <w:rPr/>
+        <w:tab/>
+        <w:tab/>
+        <w:tab/>
+        <w:t>-</w:t>
+        <w:tab/>
+      </w:r>
+      <w:r>
+        <w:rPr/>
+        <w:t>update WWW to unitywebrequest</w:t>
+      </w:r>
+    </w:p>
+    <w:p>
+      <w:pPr>
+        <w:pStyle w:val="Normal"/>
+        <w:bidi w:val="0"/>
+        <w:jc w:val="start"/>
+        <w:rPr/>
+      </w:pPr>
+      <w:r>
+        <w:rPr/>
+        <w:tab/>
+        <w:tab/>
+        <w:tab/>
+        <w:t>-</w:t>
+        <w:tab/>
+      </w:r>
+      <w:r>
+        <w:rPr/>
+        <w:t>fix obsolete graphics checks</w:t>
+      </w:r>
+    </w:p>
+    <w:p>
+      <w:pPr>
+        <w:pStyle w:val="Normal"/>
+        <w:bidi w:val="0"/>
+        <w:jc w:val="start"/>
+        <w:rPr/>
+      </w:pPr>
+      <w:r>
+        <w:rPr/>
+        <w:tab/>
+        <w:tab/>
+        <w:tab/>
+        <w:t>-</w:t>
+        <w:tab/>
+      </w:r>
+      <w:r>
+        <w:rPr/>
+        <w:t>make gui slider style look normal again</w:t>
       </w:r>
     </w:p>
     <w:p>
@@ -1142,8 +1269,8 @@
       <w:lang w:val="en-US" w:eastAsia="zh-CN" w:bidi="hi-IN"/>
     </w:rPr>
   </w:style>
-  <w:style w:type="character" w:styleId="Bulletsuser">
-    <w:name w:val="Bullets (user)"/>
+  <w:style w:type="character" w:styleId="Bullets">
+    <w:name w:val="Bullets"/>
     <w:qFormat/>
     <w:rPr>
       <w:rFonts w:ascii="OpenSymbol" w:hAnsi="OpenSymbol" w:eastAsia="OpenSymbol" w:cs="OpenSymbol"/>

</xml_diff>

<commit_message>
fix some whirld loading issues
</commit_message>
<xml_diff>
--- a/Todo.docx
+++ b/Todo.docx
@@ -135,7 +135,15 @@
         <w:tab/>
         <w:tab/>
         <w:tab/>
-        <w:t>-</w:t>
+      </w:r>
+      <w:r>
+        <w:rPr>
+          <w:color w:val="00A933"/>
+        </w:rPr>
+        <w:t>X</w:t>
+      </w:r>
+      <w:r>
+        <w:rPr/>
         <w:tab/>
         <w:t>update WWW to unitywebrequest</w:t>
       </w:r>
@@ -1155,45 +1163,6 @@
       <w:r>
         <w:rPr/>
         <w:tab/>
-        <w:tab/>
-        <w:t>-</w:t>
-        <w:tab/>
-      </w:r>
-      <w:r>
-        <w:rPr/>
-        <w:t>try load Whirld.mtl if it exists when generating a whirld</w:t>
-      </w:r>
-    </w:p>
-    <w:p>
-      <w:pPr>
-        <w:pStyle w:val="Normal"/>
-        <w:bidi w:val="0"/>
-        <w:jc w:val="start"/>
-        <w:rPr/>
-      </w:pPr>
-      <w:r>
-        <w:rPr/>
-        <w:tab/>
-        <w:tab/>
-        <w:tab/>
-        <w:t>-</w:t>
-        <w:tab/>
-      </w:r>
-      <w:r>
-        <w:rPr/>
-        <w:t>move “mtllib” code from LoadMesh into its own function LoadMaterialLibrary</w:t>
-      </w:r>
-    </w:p>
-    <w:p>
-      <w:pPr>
-        <w:pStyle w:val="Normal"/>
-        <w:bidi w:val="0"/>
-        <w:jc w:val="start"/>
-        <w:rPr/>
-      </w:pPr>
-      <w:r>
-        <w:rPr/>
-        <w:tab/>
         <w:t>-</w:t>
         <w:tab/>
         <w:t>add support for custom textures</w:t>
@@ -1211,11 +1180,7 @@
         <w:tab/>
         <w:t>-</w:t>
         <w:tab/>
-        <w:t xml:space="preserve">add support for </w:t>
-      </w:r>
-      <w:r>
-        <w:rPr/>
-        <w:t>adding rigidbodies to objects</w:t>
+        <w:t>add support for adding rigidbodies to objects</w:t>
       </w:r>
     </w:p>
     <w:p>
@@ -1245,9 +1210,6 @@
         <w:tab/>
         <w:t>-</w:t>
         <w:tab/>
-      </w:r>
-      <w:r>
-        <w:rPr/>
         <w:t>add support fro placing Billboards</w:t>
       </w:r>
     </w:p>
@@ -1264,7 +1226,7 @@
     </w:p>
     <w:sectPr>
       <w:type w:val="nextPage"/>
-      <w:pgSz w:w="18720" w:h="17291"/>
+      <w:pgSz w:w="18720" w:h="28800"/>
       <w:pgMar w:left="1136" w:right="1136" w:gutter="0" w:header="0" w:top="1136" w:footer="0" w:bottom="1136"/>
       <w:pgNumType w:fmt="none"/>
       <w:formProt w:val="false"/>
@@ -1312,8 +1274,8 @@
       <w:lang w:val="en-US" w:eastAsia="zh-CN" w:bidi="hi-IN"/>
     </w:rPr>
   </w:style>
-  <w:style w:type="character" w:styleId="Bulletsuser">
-    <w:name w:val="Bullets (user)"/>
+  <w:style w:type="character" w:styleId="Bullets">
+    <w:name w:val="Bullets"/>
     <w:qFormat/>
     <w:rPr>
       <w:rFonts w:ascii="OpenSymbol" w:hAnsi="OpenSymbol" w:eastAsia="OpenSymbol" w:cs="OpenSymbol"/>

</xml_diff>

<commit_message>
fix obsolete imageEffects check
</commit_message>
<xml_diff>
--- a/Todo.docx
+++ b/Todo.docx
@@ -160,7 +160,15 @@
         <w:tab/>
         <w:tab/>
         <w:tab/>
-        <w:t>-</w:t>
+      </w:r>
+      <w:r>
+        <w:rPr>
+          <w:color w:val="00A933"/>
+        </w:rPr>
+        <w:t>X</w:t>
+      </w:r>
+      <w:r>
+        <w:rPr/>
         <w:tab/>
         <w:t>fix obsolete graphics checks</w:t>
       </w:r>
@@ -1274,8 +1282,8 @@
       <w:lang w:val="en-US" w:eastAsia="zh-CN" w:bidi="hi-IN"/>
     </w:rPr>
   </w:style>
-  <w:style w:type="character" w:styleId="Bullets">
-    <w:name w:val="Bullets"/>
+  <w:style w:type="character" w:styleId="Bulletsuser">
+    <w:name w:val="Bullets (user)"/>
     <w:qFormat/>
     <w:rPr>
       <w:rFonts w:ascii="OpenSymbol" w:hAnsi="OpenSymbol" w:eastAsia="OpenSymbol" w:cs="OpenSymbol"/>

</xml_diff>

<commit_message>
remove weird gui slider arrows
</commit_message>
<xml_diff>
--- a/Todo.docx
+++ b/Todo.docx
@@ -185,7 +185,15 @@
         <w:tab/>
         <w:tab/>
         <w:tab/>
-        <w:t>-</w:t>
+      </w:r>
+      <w:r>
+        <w:rPr>
+          <w:color w:val="00A933"/>
+        </w:rPr>
+        <w:t>X</w:t>
+      </w:r>
+      <w:r>
+        <w:rPr/>
         <w:tab/>
         <w:t>make gui slider style look normal again</w:t>
       </w:r>
@@ -1282,8 +1290,8 @@
       <w:lang w:val="en-US" w:eastAsia="zh-CN" w:bidi="hi-IN"/>
     </w:rPr>
   </w:style>
-  <w:style w:type="character" w:styleId="Bulletsuser">
-    <w:name w:val="Bullets (user)"/>
+  <w:style w:type="character" w:styleId="Bullets">
+    <w:name w:val="Bullets"/>
     <w:qFormat/>
     <w:rPr>
       <w:rFonts w:ascii="OpenSymbol" w:hAnsi="OpenSymbol" w:eastAsia="OpenSymbol" w:cs="OpenSymbol"/>

</xml_diff>

<commit_message>
replace splatprototypes with terrainlayers
</commit_message>
<xml_diff>
--- a/Todo.docx
+++ b/Todo.docx
@@ -121,6 +121,56 @@
         <w:t>-</w:t>
         <w:tab/>
         <w:t>fix terrain</w:t>
+      </w:r>
+    </w:p>
+    <w:p>
+      <w:pPr>
+        <w:pStyle w:val="Normal"/>
+        <w:bidi w:val="0"/>
+        <w:jc w:val="start"/>
+        <w:rPr/>
+      </w:pPr>
+      <w:r>
+        <w:rPr/>
+        <w:tab/>
+        <w:tab/>
+        <w:tab/>
+        <w:tab/>
+      </w:r>
+      <w:r>
+        <w:rPr>
+          <w:color w:val="00A933"/>
+        </w:rPr>
+        <w:t>X</w:t>
+      </w:r>
+      <w:r>
+        <w:rPr/>
+        <w:tab/>
+      </w:r>
+      <w:r>
+        <w:rPr/>
+        <w:t>upgrade splat prototypes to terrain layers</w:t>
+      </w:r>
+    </w:p>
+    <w:p>
+      <w:pPr>
+        <w:pStyle w:val="Normal"/>
+        <w:bidi w:val="0"/>
+        <w:jc w:val="start"/>
+        <w:rPr/>
+      </w:pPr>
+      <w:r>
+        <w:rPr/>
+        <w:tab/>
+        <w:tab/>
+        <w:tab/>
+        <w:tab/>
+        <w:t>-</w:t>
+        <w:tab/>
+      </w:r>
+      <w:r>
+        <w:rPr/>
+        <w:t>fix the textures not showing up</w:t>
       </w:r>
     </w:p>
     <w:p>
@@ -1290,8 +1340,8 @@
       <w:lang w:val="en-US" w:eastAsia="zh-CN" w:bidi="hi-IN"/>
     </w:rPr>
   </w:style>
-  <w:style w:type="character" w:styleId="Bullets">
-    <w:name w:val="Bullets"/>
+  <w:style w:type="character" w:styleId="Bulletsuser">
+    <w:name w:val="Bullets (user)"/>
     <w:qFormat/>
     <w:rPr>
       <w:rFonts w:ascii="OpenSymbol" w:hAnsi="OpenSymbol" w:eastAsia="OpenSymbol" w:cs="OpenSymbol"/>

</xml_diff>

<commit_message>
correct the terrain shader
</commit_message>
<xml_diff>
--- a/Todo.docx
+++ b/Todo.docx
@@ -76,7 +76,15 @@
         <w:rPr/>
         <w:tab/>
         <w:tab/>
-        <w:t>-</w:t>
+      </w:r>
+      <w:r>
+        <w:rPr>
+          <w:color w:val="00A933"/>
+        </w:rPr>
+        <w:t>X</w:t>
+      </w:r>
+      <w:r>
+        <w:rPr/>
         <w:tab/>
         <w:t>upgrade to 2019.4.41f2</w:t>
       </w:r>
@@ -118,7 +126,15 @@
         <w:tab/>
         <w:tab/>
         <w:tab/>
-        <w:t>-</w:t>
+      </w:r>
+      <w:r>
+        <w:rPr>
+          <w:color w:val="00A933"/>
+        </w:rPr>
+        <w:t>X</w:t>
+      </w:r>
+      <w:r>
+        <w:rPr/>
         <w:tab/>
         <w:t>fix terrain</w:t>
       </w:r>
@@ -146,9 +162,6 @@
       <w:r>
         <w:rPr/>
         <w:tab/>
-      </w:r>
-      <w:r>
-        <w:rPr/>
         <w:t>upgrade splat prototypes to terrain layers</w:t>
       </w:r>
     </w:p>
@@ -165,11 +178,16 @@
         <w:tab/>
         <w:tab/>
         <w:tab/>
-        <w:t>-</w:t>
-        <w:tab/>
-      </w:r>
-      <w:r>
-        <w:rPr/>
+      </w:r>
+      <w:r>
+        <w:rPr>
+          <w:color w:val="00A933"/>
+        </w:rPr>
+        <w:t>X</w:t>
+      </w:r>
+      <w:r>
+        <w:rPr/>
+        <w:tab/>
         <w:t>fix the textures not showing up</w:t>
       </w:r>
     </w:p>
@@ -1340,8 +1358,8 @@
       <w:lang w:val="en-US" w:eastAsia="zh-CN" w:bidi="hi-IN"/>
     </w:rPr>
   </w:style>
-  <w:style w:type="character" w:styleId="Bulletsuser">
-    <w:name w:val="Bullets (user)"/>
+  <w:style w:type="character" w:styleId="Bullets">
+    <w:name w:val="Bullets"/>
     <w:qFormat/>
     <w:rPr>
       <w:rFonts w:ascii="OpenSymbol" w:hAnsi="OpenSymbol" w:eastAsia="OpenSymbol" w:cs="OpenSymbol"/>

</xml_diff>

<commit_message>
change asset serialization from binary to text
</commit_message>
<xml_diff>
--- a/Todo.docx
+++ b/Todo.docx
@@ -63,6 +63,25 @@
         <w:t>-</w:t>
         <w:tab/>
         <w:t>upgrade to 2022</w:t>
+      </w:r>
+    </w:p>
+    <w:p>
+      <w:pPr>
+        <w:pStyle w:val="Normal"/>
+        <w:bidi w:val="0"/>
+        <w:jc w:val="start"/>
+        <w:rPr/>
+      </w:pPr>
+      <w:r>
+        <w:rPr/>
+        <w:tab/>
+        <w:tab/>
+        <w:t>-</w:t>
+        <w:tab/>
+      </w:r>
+      <w:r>
+        <w:rPr/>
+        <w:t>upgrade to 2020.3.49f1</w:t>
       </w:r>
     </w:p>
     <w:p>

</xml_diff>

<commit_message>
upgrade unity to 2020.3.49f1
</commit_message>
<xml_diff>
--- a/Todo.docx
+++ b/Todo.docx
@@ -76,11 +76,16 @@
         <w:rPr/>
         <w:tab/>
         <w:tab/>
-        <w:t>-</w:t>
-        <w:tab/>
-      </w:r>
-      <w:r>
-        <w:rPr/>
+      </w:r>
+      <w:r>
+        <w:rPr>
+          <w:color w:val="00A933"/>
+        </w:rPr>
+        <w:t>X</w:t>
+      </w:r>
+      <w:r>
+        <w:rPr/>
+        <w:tab/>
         <w:t>upgrade to 2020.3.49f1</w:t>
       </w:r>
     </w:p>
@@ -1377,8 +1382,8 @@
       <w:lang w:val="en-US" w:eastAsia="zh-CN" w:bidi="hi-IN"/>
     </w:rPr>
   </w:style>
-  <w:style w:type="character" w:styleId="Bullets">
-    <w:name w:val="Bullets"/>
+  <w:style w:type="character" w:styleId="Bulletsuser">
+    <w:name w:val="Bullets (user)"/>
     <w:qFormat/>
     <w:rPr>
       <w:rFonts w:ascii="OpenSymbol" w:hAnsi="OpenSymbol" w:eastAsia="OpenSymbol" w:cs="OpenSymbol"/>

</xml_diff>

<commit_message>
upgrade unity to 2022.3.62f3
</commit_message>
<xml_diff>
--- a/Todo.docx
+++ b/Todo.docx
@@ -62,7 +62,73 @@
         <w:tab/>
         <w:t>-</w:t>
         <w:tab/>
-        <w:t>upgrade to 2022</w:t>
+      </w:r>
+      <w:r>
+        <w:rPr/>
+        <w:t>fix gui label hover darkening</w:t>
+      </w:r>
+    </w:p>
+    <w:p>
+      <w:pPr>
+        <w:pStyle w:val="Normal"/>
+        <w:bidi w:val="0"/>
+        <w:jc w:val="start"/>
+        <w:rPr/>
+      </w:pPr>
+      <w:r>
+        <w:rPr/>
+        <w:tab/>
+        <w:t>-</w:t>
+        <w:tab/>
+      </w:r>
+      <w:r>
+        <w:rPr/>
+        <w:t>upgrade to 2023.2.22f1</w:t>
+      </w:r>
+    </w:p>
+    <w:p>
+      <w:pPr>
+        <w:pStyle w:val="Normal"/>
+        <w:bidi w:val="0"/>
+        <w:jc w:val="start"/>
+        <w:rPr/>
+      </w:pPr>
+      <w:r>
+        <w:rPr/>
+        <w:tab/>
+        <w:t>-</w:t>
+        <w:tab/>
+      </w:r>
+      <w:r>
+        <w:rPr/>
+        <w:t>fix outdated Idispatch code in Ionic.ZLib</w:t>
+      </w:r>
+    </w:p>
+    <w:p>
+      <w:pPr>
+        <w:pStyle w:val="Normal"/>
+        <w:bidi w:val="0"/>
+        <w:jc w:val="start"/>
+        <w:rPr/>
+      </w:pPr>
+      <w:r>
+        <w:rPr/>
+        <w:tab/>
+      </w:r>
+      <w:r>
+        <w:rPr>
+          <w:color w:val="00A933"/>
+        </w:rPr>
+        <w:t>X</w:t>
+      </w:r>
+      <w:r>
+        <w:rPr/>
+        <w:tab/>
+        <w:t>upgrade to 2022.</w:t>
+      </w:r>
+      <w:r>
+        <w:rPr/>
+        <w:t>3.62f3</w:t>
       </w:r>
     </w:p>
     <w:p>
@@ -1382,8 +1448,25 @@
       <w:lang w:val="en-US" w:eastAsia="zh-CN" w:bidi="hi-IN"/>
     </w:rPr>
   </w:style>
-  <w:style w:type="character" w:styleId="Bulletsuser">
-    <w:name w:val="Bullets (user)"/>
+  <w:style w:type="paragraph" w:styleId="Heading4">
+    <w:name w:val="heading 4"/>
+    <w:basedOn w:val="Heading"/>
+    <w:next w:val="BodyText"/>
+    <w:qFormat/>
+    <w:pPr>
+      <w:spacing w:before="120" w:after="120"/>
+      <w:outlineLvl w:val="3"/>
+    </w:pPr>
+    <w:rPr>
+      <w:rFonts w:ascii="Liberation Serif" w:hAnsi="Liberation Serif" w:eastAsia="Noto Serif CJK SC" w:cs="Noto Sans Devanagari"/>
+      <w:b/>
+      <w:bCs/>
+      <w:sz w:val="24"/>
+      <w:szCs w:val="24"/>
+    </w:rPr>
+  </w:style>
+  <w:style w:type="character" w:styleId="Bullets">
+    <w:name w:val="Bullets"/>
     <w:qFormat/>
     <w:rPr>
       <w:rFonts w:ascii="OpenSymbol" w:hAnsi="OpenSymbol" w:eastAsia="OpenSymbol" w:cs="OpenSymbol"/>

</xml_diff>

<commit_message>
upgrade to unity 2023.2.22f1
</commit_message>
<xml_diff>
--- a/Todo.docx
+++ b/Todo.docx
@@ -62,9 +62,6 @@
         <w:tab/>
         <w:t>-</w:t>
         <w:tab/>
-      </w:r>
-      <w:r>
-        <w:rPr/>
         <w:t>fix gui label hover darkening</w:t>
       </w:r>
     </w:p>
@@ -78,11 +75,16 @@
       <w:r>
         <w:rPr/>
         <w:tab/>
-        <w:t>-</w:t>
-        <w:tab/>
-      </w:r>
-      <w:r>
-        <w:rPr/>
+      </w:r>
+      <w:r>
+        <w:rPr>
+          <w:color w:val="00A933"/>
+        </w:rPr>
+        <w:t>X</w:t>
+      </w:r>
+      <w:r>
+        <w:rPr/>
+        <w:tab/>
         <w:t>upgrade to 2023.2.22f1</w:t>
       </w:r>
     </w:p>
@@ -98,9 +100,6 @@
         <w:tab/>
         <w:t>-</w:t>
         <w:tab/>
-      </w:r>
-      <w:r>
-        <w:rPr/>
         <w:t>fix outdated Idispatch code in Ionic.ZLib</w:t>
       </w:r>
     </w:p>
@@ -124,11 +123,7 @@
       <w:r>
         <w:rPr/>
         <w:tab/>
-        <w:t>upgrade to 2022.</w:t>
-      </w:r>
-      <w:r>
-        <w:rPr/>
-        <w:t>3.62f3</w:t>
+        <w:t>upgrade to 2022.3.62f3</w:t>
       </w:r>
     </w:p>
     <w:p>
@@ -1465,8 +1460,8 @@
       <w:szCs w:val="24"/>
     </w:rPr>
   </w:style>
-  <w:style w:type="character" w:styleId="Bullets">
-    <w:name w:val="Bullets"/>
+  <w:style w:type="character" w:styleId="Bulletsuser">
+    <w:name w:val="Bullets (user)"/>
     <w:qFormat/>
     <w:rPr>
       <w:rFonts w:ascii="OpenSymbol" w:hAnsi="OpenSymbol" w:eastAsia="OpenSymbol" w:cs="OpenSymbol"/>

</xml_diff>